<commit_message>
Math T7 : scènes IA lot 8 final (U6 s3-11) — 79/79 scènes ; U6 rebuild 11 scènes
Co-authored-by: arena-agent <297053741+arena-agent@users.noreply.github.com>
</commit_message>
<xml_diff>
--- a/manuel-math-t7/Manuel_Mathematiques_T7_UNITE6.docx
+++ b/manuel-math-t7/Manuel_Mathematiques_T7_UNITE6.docx
@@ -2706,96 +2706,13 @@
     </w:p>
     <w:p>
       <w:pPr>
-        <w:spacing w:after="110" w:line="300"/>
-        <w:jc w:val="both"/>
-      </w:pPr>
-      <w:r>
-        <w:rPr>
-          <w:rFonts w:ascii="Times New Roman" w:cs="Times New Roman" w:eastAsia="Times New Roman" w:hAnsi="Times New Roman"/>
-          <w:b/>
-          <w:bCs/>
-          <w:i w:val="false"/>
-          <w:iCs w:val="false"/>
-          <w:color w:val="2E7D32"/>
-          <w:sz w:val="24"/>
-          <w:szCs w:val="24"/>
-        </w:rPr>
-        <w:t xml:space="preserve">Définition — </w:t>
-      </w:r>
-      <w:r>
-        <w:rPr>
-          <w:rFonts w:ascii="Times New Roman" w:cs="Times New Roman" w:eastAsia="Times New Roman" w:hAnsi="Times New Roman"/>
-          <w:b/>
-          <w:bCs/>
-          <w:i w:val="false"/>
-          <w:iCs w:val="false"/>
-          <w:color w:val="000000"/>
-          <w:sz w:val="24"/>
-          <w:szCs w:val="24"/>
-        </w:rPr>
-        <w:t xml:space="preserve">Des données brutes sont des informations recueillies telles quelles, dans l’ordre où elles arrivent, sans aucun classement. Les lire, c’est repérer la nature des données, leur nombre et quelques faits simples.</w:t>
-      </w:r>
-    </w:p>
-    <w:p>
-      <w:pPr>
-        <w:spacing w:after="110" w:line="300"/>
-        <w:jc w:val="both"/>
-      </w:pPr>
-      <w:r>
-        <w:rPr>
-          <w:rFonts w:ascii="Times New Roman" w:cs="Times New Roman" w:eastAsia="Times New Roman" w:hAnsi="Times New Roman"/>
-          <w:b/>
-          <w:bCs/>
-          <w:i w:val="false"/>
-          <w:iCs w:val="false"/>
-          <w:color w:val="1F4E79"/>
-          <w:sz w:val="24"/>
-          <w:szCs w:val="24"/>
-        </w:rPr>
-        <w:t xml:space="preserve">Autrement dit : </w:t>
-      </w:r>
-      <w:r>
-        <w:rPr>
-          <w:rFonts w:ascii="Times New Roman" w:cs="Times New Roman" w:eastAsia="Times New Roman" w:hAnsi="Times New Roman"/>
-          <w:b w:val="false"/>
-          <w:bCs w:val="false"/>
-          <w:i w:val="false"/>
-          <w:iCs w:val="false"/>
-          <w:color w:val="000000"/>
-          <w:sz w:val="24"/>
-          <w:szCs w:val="24"/>
-        </w:rPr>
-        <w:t xml:space="preserve">les données brutes, c’est la récolte en vrac — avant tout rangement.</w:t>
-      </w:r>
-    </w:p>
-    <w:p>
-      <w:pPr>
-        <w:spacing w:after="110" w:line="300"/>
-        <w:jc w:val="both"/>
-      </w:pPr>
-      <w:r>
-        <w:rPr>
-          <w:rFonts w:ascii="Times New Roman" w:cs="Times New Roman" w:eastAsia="Times New Roman" w:hAnsi="Times New Roman"/>
-          <w:b w:val="false"/>
-          <w:bCs w:val="false"/>
-          <w:i w:val="false"/>
-          <w:iCs w:val="false"/>
-          <w:color w:val="000000"/>
-          <w:sz w:val="24"/>
-          <w:szCs w:val="24"/>
-        </w:rPr>
-        <w:t xml:space="preserve">Devant une liste brute, on se pose trois questions : de quoi parle-t-on (le caractère étudié : fruit préféré) ? combien de données (l’effectif total : 12) ? quelles valeurs apparaissent (mangue, letchi, banane, ananas) ? On peut déjà repérer une valeur fréquente ou rare, mais compter précisément reste pénible : c’est pourquoi on apprendra à organiser.</w:t>
-      </w:r>
-    </w:p>
-    <w:p>
-      <w:pPr>
         <w:spacing w:after="120" w:before="120"/>
         <w:jc w:val="center"/>
       </w:pPr>
       <w:r>
         <w:drawing>
           <wp:inline distT="0" distB="0" distL="0" distR="0">
-            <wp:extent cx="4762500" cy="2314575"/>
+            <wp:extent cx="4095750" cy="2286000"/>
             <wp:effectExtent t="0" r="0" b="0" l="0"/>
             <wp:docPr id="1" name="" descr="" title=""/>
             <wp:cNvGraphicFramePr>
@@ -2812,6 +2729,135 @@
                   </pic:nvPicPr>
                   <pic:blipFill>
                     <a:blip r:embed="rId9" cstate="none"/>
+                    <a:srcRect/>
+                    <a:stretch>
+                      <a:fillRect/>
+                    </a:stretch>
+                  </pic:blipFill>
+                  <pic:spPr bwMode="auto">
+                    <a:xfrm>
+                      <a:off x="0" y="0"/>
+                      <a:ext cx="4095750" cy="2286000"/>
+                    </a:xfrm>
+                    <a:prstGeom prst="rect">
+                      <a:avLst/>
+                    </a:prstGeom>
+                  </pic:spPr>
+                </pic:pic>
+              </a:graphicData>
+            </a:graphic>
+          </wp:inline>
+        </w:drawing>
+      </w:r>
+    </w:p>
+    <w:p>
+      <w:pPr>
+        <w:spacing w:after="110" w:line="300"/>
+        <w:jc w:val="both"/>
+      </w:pPr>
+      <w:r>
+        <w:rPr>
+          <w:rFonts w:ascii="Times New Roman" w:cs="Times New Roman" w:eastAsia="Times New Roman" w:hAnsi="Times New Roman"/>
+          <w:b/>
+          <w:bCs/>
+          <w:i w:val="false"/>
+          <w:iCs w:val="false"/>
+          <w:color w:val="2E7D32"/>
+          <w:sz w:val="24"/>
+          <w:szCs w:val="24"/>
+        </w:rPr>
+        <w:t xml:space="preserve">Définition — </w:t>
+      </w:r>
+      <w:r>
+        <w:rPr>
+          <w:rFonts w:ascii="Times New Roman" w:cs="Times New Roman" w:eastAsia="Times New Roman" w:hAnsi="Times New Roman"/>
+          <w:b/>
+          <w:bCs/>
+          <w:i w:val="false"/>
+          <w:iCs w:val="false"/>
+          <w:color w:val="000000"/>
+          <w:sz w:val="24"/>
+          <w:szCs w:val="24"/>
+        </w:rPr>
+        <w:t xml:space="preserve">Des données brutes sont des informations recueillies telles quelles, dans l’ordre où elles arrivent, sans aucun classement. Les lire, c’est repérer la nature des données, leur nombre et quelques faits simples.</w:t>
+      </w:r>
+    </w:p>
+    <w:p>
+      <w:pPr>
+        <w:spacing w:after="110" w:line="300"/>
+        <w:jc w:val="both"/>
+      </w:pPr>
+      <w:r>
+        <w:rPr>
+          <w:rFonts w:ascii="Times New Roman" w:cs="Times New Roman" w:eastAsia="Times New Roman" w:hAnsi="Times New Roman"/>
+          <w:b/>
+          <w:bCs/>
+          <w:i w:val="false"/>
+          <w:iCs w:val="false"/>
+          <w:color w:val="1F4E79"/>
+          <w:sz w:val="24"/>
+          <w:szCs w:val="24"/>
+        </w:rPr>
+        <w:t xml:space="preserve">Autrement dit : </w:t>
+      </w:r>
+      <w:r>
+        <w:rPr>
+          <w:rFonts w:ascii="Times New Roman" w:cs="Times New Roman" w:eastAsia="Times New Roman" w:hAnsi="Times New Roman"/>
+          <w:b w:val="false"/>
+          <w:bCs w:val="false"/>
+          <w:i w:val="false"/>
+          <w:iCs w:val="false"/>
+          <w:color w:val="000000"/>
+          <w:sz w:val="24"/>
+          <w:szCs w:val="24"/>
+        </w:rPr>
+        <w:t xml:space="preserve">les données brutes, c’est la récolte en vrac — avant tout rangement.</w:t>
+      </w:r>
+    </w:p>
+    <w:p>
+      <w:pPr>
+        <w:spacing w:after="110" w:line="300"/>
+        <w:jc w:val="both"/>
+      </w:pPr>
+      <w:r>
+        <w:rPr>
+          <w:rFonts w:ascii="Times New Roman" w:cs="Times New Roman" w:eastAsia="Times New Roman" w:hAnsi="Times New Roman"/>
+          <w:b w:val="false"/>
+          <w:bCs w:val="false"/>
+          <w:i w:val="false"/>
+          <w:iCs w:val="false"/>
+          <w:color w:val="000000"/>
+          <w:sz w:val="24"/>
+          <w:szCs w:val="24"/>
+        </w:rPr>
+        <w:t xml:space="preserve">Devant une liste brute, on se pose trois questions : de quoi parle-t-on (le caractère étudié : fruit préféré) ? combien de données (l’effectif total : 12) ? quelles valeurs apparaissent (mangue, letchi, banane, ananas) ? On peut déjà repérer une valeur fréquente ou rare, mais compter précisément reste pénible : c’est pourquoi on apprendra à organiser.</w:t>
+      </w:r>
+    </w:p>
+    <w:p>
+      <w:pPr>
+        <w:spacing w:after="120" w:before="120"/>
+        <w:jc w:val="center"/>
+      </w:pPr>
+      <w:r>
+        <w:drawing>
+          <wp:inline distT="0" distB="0" distL="0" distR="0">
+            <wp:extent cx="4762500" cy="2314575"/>
+            <wp:effectExtent t="0" r="0" b="0" l="0"/>
+            <wp:docPr id="2" name="" descr="" title=""/>
+            <wp:cNvGraphicFramePr>
+              <a:graphicFrameLocks xmlns:a="http://schemas.openxmlformats.org/drawingml/2006/main" noChangeAspect="1"/>
+            </wp:cNvGraphicFramePr>
+            <a:graphic xmlns:a="http://schemas.openxmlformats.org/drawingml/2006/main">
+              <a:graphicData uri="http://schemas.openxmlformats.org/drawingml/2006/picture">
+                <pic:pic xmlns:pic="http://schemas.openxmlformats.org/drawingml/2006/picture">
+                  <pic:nvPicPr>
+                    <pic:cNvPr id="0" name="" descr=""/>
+                    <pic:cNvPicPr>
+                      <a:picLocks noChangeAspect="1" noChangeArrowheads="1"/>
+                    </pic:cNvPicPr>
+                  </pic:nvPicPr>
+                  <pic:blipFill>
+                    <a:blip r:embed="rId10" cstate="none"/>
                     <a:srcRect/>
                     <a:stretch>
                       <a:fillRect/>
@@ -5555,98 +5601,15 @@
     </w:p>
     <w:p>
       <w:pPr>
-        <w:spacing w:after="110" w:line="300"/>
-        <w:jc w:val="both"/>
-      </w:pPr>
-      <w:r>
-        <w:rPr>
-          <w:rFonts w:ascii="Times New Roman" w:cs="Times New Roman" w:eastAsia="Times New Roman" w:hAnsi="Times New Roman"/>
-          <w:b/>
-          <w:bCs/>
-          <w:i w:val="false"/>
-          <w:iCs w:val="false"/>
-          <w:color w:val="2E7D32"/>
-          <w:sz w:val="24"/>
-          <w:szCs w:val="24"/>
-        </w:rPr>
-        <w:t xml:space="preserve">Définition — </w:t>
-      </w:r>
-      <w:r>
-        <w:rPr>
-          <w:rFonts w:ascii="Times New Roman" w:cs="Times New Roman" w:eastAsia="Times New Roman" w:hAnsi="Times New Roman"/>
-          <w:b/>
-          <w:bCs/>
-          <w:i w:val="false"/>
-          <w:iCs w:val="false"/>
-          <w:color w:val="000000"/>
-          <w:sz w:val="24"/>
-          <w:szCs w:val="24"/>
-        </w:rPr>
-        <w:t xml:space="preserve">Organiser des données, c’est les classer pour les rendre lisibles. La feuille de comptage attribue une ligne à chaque valeur : on y trace un trait par donnée lue, en groupant les traits par paquets de cinq.</w:t>
-      </w:r>
-    </w:p>
-    <w:p>
-      <w:pPr>
-        <w:spacing w:after="110" w:line="300"/>
-        <w:jc w:val="both"/>
-      </w:pPr>
-      <w:r>
-        <w:rPr>
-          <w:rFonts w:ascii="Times New Roman" w:cs="Times New Roman" w:eastAsia="Times New Roman" w:hAnsi="Times New Roman"/>
-          <w:b/>
-          <w:bCs/>
-          <w:i w:val="false"/>
-          <w:iCs w:val="false"/>
-          <w:color w:val="1F4E79"/>
-          <w:sz w:val="24"/>
-          <w:szCs w:val="24"/>
-        </w:rPr>
-        <w:t xml:space="preserve">Autrement dit : </w:t>
-      </w:r>
-      <w:r>
-        <w:rPr>
-          <w:rFonts w:ascii="Times New Roman" w:cs="Times New Roman" w:eastAsia="Times New Roman" w:hAnsi="Times New Roman"/>
-          <w:b w:val="false"/>
-          <w:bCs w:val="false"/>
-          <w:i w:val="false"/>
-          <w:iCs w:val="false"/>
-          <w:color w:val="000000"/>
-          <w:sz w:val="24"/>
-          <w:szCs w:val="24"/>
-        </w:rPr>
-        <w:t xml:space="preserve">un trait par réponse, des paquets de cinq, et le compte est bon.</w:t>
-      </w:r>
-    </w:p>
-    <w:p>
-      <w:pPr>
-        <w:spacing w:after="110" w:line="300"/>
-        <w:jc w:val="both"/>
-      </w:pPr>
-      <w:r>
-        <w:rPr>
-          <w:rFonts w:ascii="Times New Roman" w:cs="Times New Roman" w:eastAsia="Times New Roman" w:hAnsi="Times New Roman"/>
-          <w:b w:val="false"/>
-          <w:bCs w:val="false"/>
-          <w:i w:val="false"/>
-          <w:iCs w:val="false"/>
-          <w:color w:val="000000"/>
-          <w:sz w:val="24"/>
-          <w:szCs w:val="24"/>
-        </w:rPr>
-        <w:t xml:space="preserve">La méthode des traits évite de relire la liste plusieurs fois : chaque donnée est lue une seule fois et marquée aussitôt. Le cinquième trait barre les quatre premiers, ce qui forme des paquets faciles à compter : deux paquets et trois traits = 13. On vérifie toujours que la somme des comptages redonne l’effectif total.</w:t>
-      </w:r>
-    </w:p>
-    <w:p>
-      <w:pPr>
         <w:spacing w:after="120" w:before="120"/>
         <w:jc w:val="center"/>
       </w:pPr>
       <w:r>
         <w:drawing>
           <wp:inline distT="0" distB="0" distL="0" distR="0">
-            <wp:extent cx="4762500" cy="2209800"/>
+            <wp:extent cx="4095750" cy="2286000"/>
             <wp:effectExtent t="0" r="0" b="0" l="0"/>
-            <wp:docPr id="2" name="" descr="" title=""/>
+            <wp:docPr id="3" name="" descr="" title=""/>
             <wp:cNvGraphicFramePr>
               <a:graphicFrameLocks xmlns:a="http://schemas.openxmlformats.org/drawingml/2006/main" noChangeAspect="1"/>
             </wp:cNvGraphicFramePr>
@@ -5660,7 +5623,136 @@
                     </pic:cNvPicPr>
                   </pic:nvPicPr>
                   <pic:blipFill>
-                    <a:blip r:embed="rId10" cstate="none"/>
+                    <a:blip r:embed="rId11" cstate="none"/>
+                    <a:srcRect/>
+                    <a:stretch>
+                      <a:fillRect/>
+                    </a:stretch>
+                  </pic:blipFill>
+                  <pic:spPr bwMode="auto">
+                    <a:xfrm>
+                      <a:off x="0" y="0"/>
+                      <a:ext cx="4095750" cy="2286000"/>
+                    </a:xfrm>
+                    <a:prstGeom prst="rect">
+                      <a:avLst/>
+                    </a:prstGeom>
+                  </pic:spPr>
+                </pic:pic>
+              </a:graphicData>
+            </a:graphic>
+          </wp:inline>
+        </w:drawing>
+      </w:r>
+    </w:p>
+    <w:p>
+      <w:pPr>
+        <w:spacing w:after="110" w:line="300"/>
+        <w:jc w:val="both"/>
+      </w:pPr>
+      <w:r>
+        <w:rPr>
+          <w:rFonts w:ascii="Times New Roman" w:cs="Times New Roman" w:eastAsia="Times New Roman" w:hAnsi="Times New Roman"/>
+          <w:b/>
+          <w:bCs/>
+          <w:i w:val="false"/>
+          <w:iCs w:val="false"/>
+          <w:color w:val="2E7D32"/>
+          <w:sz w:val="24"/>
+          <w:szCs w:val="24"/>
+        </w:rPr>
+        <w:t xml:space="preserve">Définition — </w:t>
+      </w:r>
+      <w:r>
+        <w:rPr>
+          <w:rFonts w:ascii="Times New Roman" w:cs="Times New Roman" w:eastAsia="Times New Roman" w:hAnsi="Times New Roman"/>
+          <w:b/>
+          <w:bCs/>
+          <w:i w:val="false"/>
+          <w:iCs w:val="false"/>
+          <w:color w:val="000000"/>
+          <w:sz w:val="24"/>
+          <w:szCs w:val="24"/>
+        </w:rPr>
+        <w:t xml:space="preserve">Organiser des données, c’est les classer pour les rendre lisibles. La feuille de comptage attribue une ligne à chaque valeur : on y trace un trait par donnée lue, en groupant les traits par paquets de cinq.</w:t>
+      </w:r>
+    </w:p>
+    <w:p>
+      <w:pPr>
+        <w:spacing w:after="110" w:line="300"/>
+        <w:jc w:val="both"/>
+      </w:pPr>
+      <w:r>
+        <w:rPr>
+          <w:rFonts w:ascii="Times New Roman" w:cs="Times New Roman" w:eastAsia="Times New Roman" w:hAnsi="Times New Roman"/>
+          <w:b/>
+          <w:bCs/>
+          <w:i w:val="false"/>
+          <w:iCs w:val="false"/>
+          <w:color w:val="1F4E79"/>
+          <w:sz w:val="24"/>
+          <w:szCs w:val="24"/>
+        </w:rPr>
+        <w:t xml:space="preserve">Autrement dit : </w:t>
+      </w:r>
+      <w:r>
+        <w:rPr>
+          <w:rFonts w:ascii="Times New Roman" w:cs="Times New Roman" w:eastAsia="Times New Roman" w:hAnsi="Times New Roman"/>
+          <w:b w:val="false"/>
+          <w:bCs w:val="false"/>
+          <w:i w:val="false"/>
+          <w:iCs w:val="false"/>
+          <w:color w:val="000000"/>
+          <w:sz w:val="24"/>
+          <w:szCs w:val="24"/>
+        </w:rPr>
+        <w:t xml:space="preserve">un trait par réponse, des paquets de cinq, et le compte est bon.</w:t>
+      </w:r>
+    </w:p>
+    <w:p>
+      <w:pPr>
+        <w:spacing w:after="110" w:line="300"/>
+        <w:jc w:val="both"/>
+      </w:pPr>
+      <w:r>
+        <w:rPr>
+          <w:rFonts w:ascii="Times New Roman" w:cs="Times New Roman" w:eastAsia="Times New Roman" w:hAnsi="Times New Roman"/>
+          <w:b w:val="false"/>
+          <w:bCs w:val="false"/>
+          <w:i w:val="false"/>
+          <w:iCs w:val="false"/>
+          <w:color w:val="000000"/>
+          <w:sz w:val="24"/>
+          <w:szCs w:val="24"/>
+        </w:rPr>
+        <w:t xml:space="preserve">La méthode des traits évite de relire la liste plusieurs fois : chaque donnée est lue une seule fois et marquée aussitôt. Le cinquième trait barre les quatre premiers, ce qui forme des paquets faciles à compter : deux paquets et trois traits = 13. On vérifie toujours que la somme des comptages redonne l’effectif total.</w:t>
+      </w:r>
+    </w:p>
+    <w:p>
+      <w:pPr>
+        <w:spacing w:after="120" w:before="120"/>
+        <w:jc w:val="center"/>
+      </w:pPr>
+      <w:r>
+        <w:drawing>
+          <wp:inline distT="0" distB="0" distL="0" distR="0">
+            <wp:extent cx="4762500" cy="2209800"/>
+            <wp:effectExtent t="0" r="0" b="0" l="0"/>
+            <wp:docPr id="4" name="" descr="" title=""/>
+            <wp:cNvGraphicFramePr>
+              <a:graphicFrameLocks xmlns:a="http://schemas.openxmlformats.org/drawingml/2006/main" noChangeAspect="1"/>
+            </wp:cNvGraphicFramePr>
+            <a:graphic xmlns:a="http://schemas.openxmlformats.org/drawingml/2006/main">
+              <a:graphicData uri="http://schemas.openxmlformats.org/drawingml/2006/picture">
+                <pic:pic xmlns:pic="http://schemas.openxmlformats.org/drawingml/2006/picture">
+                  <pic:nvPicPr>
+                    <pic:cNvPr id="0" name="" descr=""/>
+                    <pic:cNvPicPr>
+                      <a:picLocks noChangeAspect="1" noChangeArrowheads="1"/>
+                    </pic:cNvPicPr>
+                  </pic:nvPicPr>
+                  <pic:blipFill>
+                    <a:blip r:embed="rId12" cstate="none"/>
                     <a:srcRect/>
                     <a:stretch>
                       <a:fillRect/>
@@ -8458,98 +8550,15 @@
     </w:p>
     <w:p>
       <w:pPr>
-        <w:spacing w:after="110" w:line="300"/>
-        <w:jc w:val="both"/>
-      </w:pPr>
-      <w:r>
-        <w:rPr>
-          <w:rFonts w:ascii="Times New Roman" w:cs="Times New Roman" w:eastAsia="Times New Roman" w:hAnsi="Times New Roman"/>
-          <w:b/>
-          <w:bCs/>
-          <w:i w:val="false"/>
-          <w:iCs w:val="false"/>
-          <w:color w:val="2E7D32"/>
-          <w:sz w:val="24"/>
-          <w:szCs w:val="24"/>
-        </w:rPr>
-        <w:t xml:space="preserve">Définition — </w:t>
-      </w:r>
-      <w:r>
-        <w:rPr>
-          <w:rFonts w:ascii="Times New Roman" w:cs="Times New Roman" w:eastAsia="Times New Roman" w:hAnsi="Times New Roman"/>
-          <w:b/>
-          <w:bCs/>
-          <w:i w:val="false"/>
-          <w:iCs w:val="false"/>
-          <w:color w:val="000000"/>
-          <w:sz w:val="24"/>
-          <w:szCs w:val="24"/>
-        </w:rPr>
-        <w:t xml:space="preserve">L’effectif d’une valeur est le nombre de fois où cette valeur apparaît dans les données. Le tableau des effectifs présente chaque valeur avec son effectif ; l’effectif total est la somme de tous les effectifs.</w:t>
-      </w:r>
-    </w:p>
-    <w:p>
-      <w:pPr>
-        <w:spacing w:after="110" w:line="300"/>
-        <w:jc w:val="both"/>
-      </w:pPr>
-      <w:r>
-        <w:rPr>
-          <w:rFonts w:ascii="Times New Roman" w:cs="Times New Roman" w:eastAsia="Times New Roman" w:hAnsi="Times New Roman"/>
-          <w:b/>
-          <w:bCs/>
-          <w:i w:val="false"/>
-          <w:iCs w:val="false"/>
-          <w:color w:val="1F4E79"/>
-          <w:sz w:val="24"/>
-          <w:szCs w:val="24"/>
-        </w:rPr>
-        <w:t xml:space="preserve">Autrement dit : </w:t>
-      </w:r>
-      <w:r>
-        <w:rPr>
-          <w:rFonts w:ascii="Times New Roman" w:cs="Times New Roman" w:eastAsia="Times New Roman" w:hAnsi="Times New Roman"/>
-          <w:b w:val="false"/>
-          <w:bCs w:val="false"/>
-          <w:i w:val="false"/>
-          <w:iCs w:val="false"/>
-          <w:color w:val="000000"/>
-          <w:sz w:val="24"/>
-          <w:szCs w:val="24"/>
-        </w:rPr>
-        <w:t xml:space="preserve">le tableau des effectifs, c’est la feuille de comptage mise au propre, avec le total au bout.</w:t>
-      </w:r>
-    </w:p>
-    <w:p>
-      <w:pPr>
-        <w:spacing w:after="110" w:line="300"/>
-        <w:jc w:val="both"/>
-      </w:pPr>
-      <w:r>
-        <w:rPr>
-          <w:rFonts w:ascii="Times New Roman" w:cs="Times New Roman" w:eastAsia="Times New Roman" w:hAnsi="Times New Roman"/>
-          <w:b w:val="false"/>
-          <w:bCs w:val="false"/>
-          <w:i w:val="false"/>
-          <w:iCs w:val="false"/>
-          <w:color w:val="000000"/>
-          <w:sz w:val="24"/>
-          <w:szCs w:val="24"/>
-        </w:rPr>
-        <w:t xml:space="preserve">Le tableau comporte une ligne (ou colonne) pour les valeurs et une pour les effectifs, plus une case Total. Ce total est un garde-fou : s’il ne redonne pas le nombre de données de départ, une erreur s’est glissée quelque part. Le tableau permet déjà de répondre vite : valeur la plus fréquente (le mode), valeur la plus rare, comparaisons.</w:t>
-      </w:r>
-    </w:p>
-    <w:p>
-      <w:pPr>
         <w:spacing w:after="120" w:before="120"/>
         <w:jc w:val="center"/>
       </w:pPr>
       <w:r>
         <w:drawing>
           <wp:inline distT="0" distB="0" distL="0" distR="0">
-            <wp:extent cx="4762500" cy="2019300"/>
+            <wp:extent cx="4095750" cy="2286000"/>
             <wp:effectExtent t="0" r="0" b="0" l="0"/>
-            <wp:docPr id="3" name="" descr="" title=""/>
+            <wp:docPr id="5" name="" descr="" title=""/>
             <wp:cNvGraphicFramePr>
               <a:graphicFrameLocks xmlns:a="http://schemas.openxmlformats.org/drawingml/2006/main" noChangeAspect="1"/>
             </wp:cNvGraphicFramePr>
@@ -8563,7 +8572,136 @@
                     </pic:cNvPicPr>
                   </pic:nvPicPr>
                   <pic:blipFill>
-                    <a:blip r:embed="rId11" cstate="none"/>
+                    <a:blip r:embed="rId13" cstate="none"/>
+                    <a:srcRect/>
+                    <a:stretch>
+                      <a:fillRect/>
+                    </a:stretch>
+                  </pic:blipFill>
+                  <pic:spPr bwMode="auto">
+                    <a:xfrm>
+                      <a:off x="0" y="0"/>
+                      <a:ext cx="4095750" cy="2286000"/>
+                    </a:xfrm>
+                    <a:prstGeom prst="rect">
+                      <a:avLst/>
+                    </a:prstGeom>
+                  </pic:spPr>
+                </pic:pic>
+              </a:graphicData>
+            </a:graphic>
+          </wp:inline>
+        </w:drawing>
+      </w:r>
+    </w:p>
+    <w:p>
+      <w:pPr>
+        <w:spacing w:after="110" w:line="300"/>
+        <w:jc w:val="both"/>
+      </w:pPr>
+      <w:r>
+        <w:rPr>
+          <w:rFonts w:ascii="Times New Roman" w:cs="Times New Roman" w:eastAsia="Times New Roman" w:hAnsi="Times New Roman"/>
+          <w:b/>
+          <w:bCs/>
+          <w:i w:val="false"/>
+          <w:iCs w:val="false"/>
+          <w:color w:val="2E7D32"/>
+          <w:sz w:val="24"/>
+          <w:szCs w:val="24"/>
+        </w:rPr>
+        <w:t xml:space="preserve">Définition — </w:t>
+      </w:r>
+      <w:r>
+        <w:rPr>
+          <w:rFonts w:ascii="Times New Roman" w:cs="Times New Roman" w:eastAsia="Times New Roman" w:hAnsi="Times New Roman"/>
+          <w:b/>
+          <w:bCs/>
+          <w:i w:val="false"/>
+          <w:iCs w:val="false"/>
+          <w:color w:val="000000"/>
+          <w:sz w:val="24"/>
+          <w:szCs w:val="24"/>
+        </w:rPr>
+        <w:t xml:space="preserve">L’effectif d’une valeur est le nombre de fois où cette valeur apparaît dans les données. Le tableau des effectifs présente chaque valeur avec son effectif ; l’effectif total est la somme de tous les effectifs.</w:t>
+      </w:r>
+    </w:p>
+    <w:p>
+      <w:pPr>
+        <w:spacing w:after="110" w:line="300"/>
+        <w:jc w:val="both"/>
+      </w:pPr>
+      <w:r>
+        <w:rPr>
+          <w:rFonts w:ascii="Times New Roman" w:cs="Times New Roman" w:eastAsia="Times New Roman" w:hAnsi="Times New Roman"/>
+          <w:b/>
+          <w:bCs/>
+          <w:i w:val="false"/>
+          <w:iCs w:val="false"/>
+          <w:color w:val="1F4E79"/>
+          <w:sz w:val="24"/>
+          <w:szCs w:val="24"/>
+        </w:rPr>
+        <w:t xml:space="preserve">Autrement dit : </w:t>
+      </w:r>
+      <w:r>
+        <w:rPr>
+          <w:rFonts w:ascii="Times New Roman" w:cs="Times New Roman" w:eastAsia="Times New Roman" w:hAnsi="Times New Roman"/>
+          <w:b w:val="false"/>
+          <w:bCs w:val="false"/>
+          <w:i w:val="false"/>
+          <w:iCs w:val="false"/>
+          <w:color w:val="000000"/>
+          <w:sz w:val="24"/>
+          <w:szCs w:val="24"/>
+        </w:rPr>
+        <w:t xml:space="preserve">le tableau des effectifs, c’est la feuille de comptage mise au propre, avec le total au bout.</w:t>
+      </w:r>
+    </w:p>
+    <w:p>
+      <w:pPr>
+        <w:spacing w:after="110" w:line="300"/>
+        <w:jc w:val="both"/>
+      </w:pPr>
+      <w:r>
+        <w:rPr>
+          <w:rFonts w:ascii="Times New Roman" w:cs="Times New Roman" w:eastAsia="Times New Roman" w:hAnsi="Times New Roman"/>
+          <w:b w:val="false"/>
+          <w:bCs w:val="false"/>
+          <w:i w:val="false"/>
+          <w:iCs w:val="false"/>
+          <w:color w:val="000000"/>
+          <w:sz w:val="24"/>
+          <w:szCs w:val="24"/>
+        </w:rPr>
+        <w:t xml:space="preserve">Le tableau comporte une ligne (ou colonne) pour les valeurs et une pour les effectifs, plus une case Total. Ce total est un garde-fou : s’il ne redonne pas le nombre de données de départ, une erreur s’est glissée quelque part. Le tableau permet déjà de répondre vite : valeur la plus fréquente (le mode), valeur la plus rare, comparaisons.</w:t>
+      </w:r>
+    </w:p>
+    <w:p>
+      <w:pPr>
+        <w:spacing w:after="120" w:before="120"/>
+        <w:jc w:val="center"/>
+      </w:pPr>
+      <w:r>
+        <w:drawing>
+          <wp:inline distT="0" distB="0" distL="0" distR="0">
+            <wp:extent cx="4762500" cy="2019300"/>
+            <wp:effectExtent t="0" r="0" b="0" l="0"/>
+            <wp:docPr id="6" name="" descr="" title=""/>
+            <wp:cNvGraphicFramePr>
+              <a:graphicFrameLocks xmlns:a="http://schemas.openxmlformats.org/drawingml/2006/main" noChangeAspect="1"/>
+            </wp:cNvGraphicFramePr>
+            <a:graphic xmlns:a="http://schemas.openxmlformats.org/drawingml/2006/main">
+              <a:graphicData uri="http://schemas.openxmlformats.org/drawingml/2006/picture">
+                <pic:pic xmlns:pic="http://schemas.openxmlformats.org/drawingml/2006/picture">
+                  <pic:nvPicPr>
+                    <pic:cNvPr id="0" name="" descr=""/>
+                    <pic:cNvPicPr>
+                      <a:picLocks noChangeAspect="1" noChangeArrowheads="1"/>
+                    </pic:cNvPicPr>
+                  </pic:nvPicPr>
+                  <pic:blipFill>
+                    <a:blip r:embed="rId14" cstate="none"/>
                     <a:srcRect/>
                     <a:stretch>
                       <a:fillRect/>
@@ -11874,6 +12012,52 @@
     </w:p>
     <w:p>
       <w:pPr>
+        <w:spacing w:after="120" w:before="120"/>
+        <w:jc w:val="center"/>
+      </w:pPr>
+      <w:r>
+        <w:drawing>
+          <wp:inline distT="0" distB="0" distL="0" distR="0">
+            <wp:extent cx="4095750" cy="2286000"/>
+            <wp:effectExtent t="0" r="0" b="0" l="0"/>
+            <wp:docPr id="7" name="" descr="" title=""/>
+            <wp:cNvGraphicFramePr>
+              <a:graphicFrameLocks xmlns:a="http://schemas.openxmlformats.org/drawingml/2006/main" noChangeAspect="1"/>
+            </wp:cNvGraphicFramePr>
+            <a:graphic xmlns:a="http://schemas.openxmlformats.org/drawingml/2006/main">
+              <a:graphicData uri="http://schemas.openxmlformats.org/drawingml/2006/picture">
+                <pic:pic xmlns:pic="http://schemas.openxmlformats.org/drawingml/2006/picture">
+                  <pic:nvPicPr>
+                    <pic:cNvPr id="0" name="" descr=""/>
+                    <pic:cNvPicPr>
+                      <a:picLocks noChangeAspect="1" noChangeArrowheads="1"/>
+                    </pic:cNvPicPr>
+                  </pic:nvPicPr>
+                  <pic:blipFill>
+                    <a:blip r:embed="rId15" cstate="none"/>
+                    <a:srcRect/>
+                    <a:stretch>
+                      <a:fillRect/>
+                    </a:stretch>
+                  </pic:blipFill>
+                  <pic:spPr bwMode="auto">
+                    <a:xfrm>
+                      <a:off x="0" y="0"/>
+                      <a:ext cx="4095750" cy="2286000"/>
+                    </a:xfrm>
+                    <a:prstGeom prst="rect">
+                      <a:avLst/>
+                    </a:prstGeom>
+                  </pic:spPr>
+                </pic:pic>
+              </a:graphicData>
+            </a:graphic>
+          </wp:inline>
+        </w:drawing>
+      </w:r>
+    </w:p>
+    <w:p>
+      <w:pPr>
         <w:spacing w:after="110" w:line="300"/>
         <w:jc w:val="both"/>
       </w:pPr>
@@ -12019,7 +12203,7 @@
           <wp:inline distT="0" distB="0" distL="0" distR="0">
             <wp:extent cx="4762500" cy="1638300"/>
             <wp:effectExtent t="0" r="0" b="0" l="0"/>
-            <wp:docPr id="4" name="" descr="" title=""/>
+            <wp:docPr id="8" name="" descr="" title=""/>
             <wp:cNvGraphicFramePr>
               <a:graphicFrameLocks xmlns:a="http://schemas.openxmlformats.org/drawingml/2006/main" noChangeAspect="1"/>
             </wp:cNvGraphicFramePr>
@@ -12033,7 +12217,7 @@
                     </pic:cNvPicPr>
                   </pic:nvPicPr>
                   <pic:blipFill>
-                    <a:blip r:embed="rId12" cstate="none"/>
+                    <a:blip r:embed="rId16" cstate="none"/>
                     <a:srcRect/>
                     <a:stretch>
                       <a:fillRect/>
@@ -15074,98 +15258,15 @@
     </w:p>
     <w:p>
       <w:pPr>
-        <w:spacing w:after="110" w:line="300"/>
-        <w:jc w:val="both"/>
-      </w:pPr>
-      <w:r>
-        <w:rPr>
-          <w:rFonts w:ascii="Times New Roman" w:cs="Times New Roman" w:eastAsia="Times New Roman" w:hAnsi="Times New Roman"/>
-          <w:b/>
-          <w:bCs/>
-          <w:i w:val="false"/>
-          <w:iCs w:val="false"/>
-          <w:color w:val="2E7D32"/>
-          <w:sz w:val="24"/>
-          <w:szCs w:val="24"/>
-        </w:rPr>
-        <w:t xml:space="preserve">Définition — </w:t>
-      </w:r>
-      <w:r>
-        <w:rPr>
-          <w:rFonts w:ascii="Times New Roman" w:cs="Times New Roman" w:eastAsia="Times New Roman" w:hAnsi="Times New Roman"/>
-          <w:b/>
-          <w:bCs/>
-          <w:i w:val="false"/>
-          <w:iCs w:val="false"/>
-          <w:color w:val="000000"/>
-          <w:sz w:val="24"/>
-          <w:szCs w:val="24"/>
-        </w:rPr>
-        <w:t xml:space="preserve">Un diagramme à bandes représente chaque valeur par une bande (un rectangle) dont la hauteur est proportionnelle à l’effectif. Les bandes ont toutes la même largeur et sont régulièrement espacées ; un axe gradué permet de lire les effectifs.</w:t>
-      </w:r>
-    </w:p>
-    <w:p>
-      <w:pPr>
-        <w:spacing w:after="110" w:line="300"/>
-        <w:jc w:val="both"/>
-      </w:pPr>
-      <w:r>
-        <w:rPr>
-          <w:rFonts w:ascii="Times New Roman" w:cs="Times New Roman" w:eastAsia="Times New Roman" w:hAnsi="Times New Roman"/>
-          <w:b/>
-          <w:bCs/>
-          <w:i w:val="false"/>
-          <w:iCs w:val="false"/>
-          <w:color w:val="1F4E79"/>
-          <w:sz w:val="24"/>
-          <w:szCs w:val="24"/>
-        </w:rPr>
-        <w:t xml:space="preserve">Autrement dit : </w:t>
-      </w:r>
-      <w:r>
-        <w:rPr>
-          <w:rFonts w:ascii="Times New Roman" w:cs="Times New Roman" w:eastAsia="Times New Roman" w:hAnsi="Times New Roman"/>
-          <w:b w:val="false"/>
-          <w:bCs w:val="false"/>
-          <w:i w:val="false"/>
-          <w:iCs w:val="false"/>
-          <w:color w:val="000000"/>
-          <w:sz w:val="24"/>
-          <w:szCs w:val="24"/>
-        </w:rPr>
-        <w:t xml:space="preserve">une bande par valeur, et plus l’effectif est grand, plus la bande monte.</w:t>
-      </w:r>
-    </w:p>
-    <w:p>
-      <w:pPr>
-        <w:spacing w:after="110" w:line="300"/>
-        <w:jc w:val="both"/>
-      </w:pPr>
-      <w:r>
-        <w:rPr>
-          <w:rFonts w:ascii="Times New Roman" w:cs="Times New Roman" w:eastAsia="Times New Roman" w:hAnsi="Times New Roman"/>
-          <w:b w:val="false"/>
-          <w:bCs w:val="false"/>
-          <w:i w:val="false"/>
-          <w:iCs w:val="false"/>
-          <w:color w:val="000000"/>
-          <w:sz w:val="24"/>
-          <w:szCs w:val="24"/>
-        </w:rPr>
-        <w:t xml:space="preserve">La construction exige trois soins : choisir une graduation régulière (ici 1 carreau = 1 élève), donner la même largeur à toutes les bandes, et écrire les noms sous les bandes. La lecture est alors immédiate : la bande la plus haute donne le mode, et les comparaisons se font à l’œil. À l’inverse, savoir LIRE un diagramme, c’est retrouver le tableau d’effectifs à partir des hauteurs.</w:t>
-      </w:r>
-    </w:p>
-    <w:p>
-      <w:pPr>
         <w:spacing w:after="120" w:before="120"/>
         <w:jc w:val="center"/>
       </w:pPr>
       <w:r>
         <w:drawing>
           <wp:inline distT="0" distB="0" distL="0" distR="0">
-            <wp:extent cx="4762500" cy="2352675"/>
+            <wp:extent cx="4095750" cy="2286000"/>
             <wp:effectExtent t="0" r="0" b="0" l="0"/>
-            <wp:docPr id="5" name="" descr="" title=""/>
+            <wp:docPr id="9" name="" descr="" title=""/>
             <wp:cNvGraphicFramePr>
               <a:graphicFrameLocks xmlns:a="http://schemas.openxmlformats.org/drawingml/2006/main" noChangeAspect="1"/>
             </wp:cNvGraphicFramePr>
@@ -15179,7 +15280,136 @@
                     </pic:cNvPicPr>
                   </pic:nvPicPr>
                   <pic:blipFill>
-                    <a:blip r:embed="rId13" cstate="none"/>
+                    <a:blip r:embed="rId17" cstate="none"/>
+                    <a:srcRect/>
+                    <a:stretch>
+                      <a:fillRect/>
+                    </a:stretch>
+                  </pic:blipFill>
+                  <pic:spPr bwMode="auto">
+                    <a:xfrm>
+                      <a:off x="0" y="0"/>
+                      <a:ext cx="4095750" cy="2286000"/>
+                    </a:xfrm>
+                    <a:prstGeom prst="rect">
+                      <a:avLst/>
+                    </a:prstGeom>
+                  </pic:spPr>
+                </pic:pic>
+              </a:graphicData>
+            </a:graphic>
+          </wp:inline>
+        </w:drawing>
+      </w:r>
+    </w:p>
+    <w:p>
+      <w:pPr>
+        <w:spacing w:after="110" w:line="300"/>
+        <w:jc w:val="both"/>
+      </w:pPr>
+      <w:r>
+        <w:rPr>
+          <w:rFonts w:ascii="Times New Roman" w:cs="Times New Roman" w:eastAsia="Times New Roman" w:hAnsi="Times New Roman"/>
+          <w:b/>
+          <w:bCs/>
+          <w:i w:val="false"/>
+          <w:iCs w:val="false"/>
+          <w:color w:val="2E7D32"/>
+          <w:sz w:val="24"/>
+          <w:szCs w:val="24"/>
+        </w:rPr>
+        <w:t xml:space="preserve">Définition — </w:t>
+      </w:r>
+      <w:r>
+        <w:rPr>
+          <w:rFonts w:ascii="Times New Roman" w:cs="Times New Roman" w:eastAsia="Times New Roman" w:hAnsi="Times New Roman"/>
+          <w:b/>
+          <w:bCs/>
+          <w:i w:val="false"/>
+          <w:iCs w:val="false"/>
+          <w:color w:val="000000"/>
+          <w:sz w:val="24"/>
+          <w:szCs w:val="24"/>
+        </w:rPr>
+        <w:t xml:space="preserve">Un diagramme à bandes représente chaque valeur par une bande (un rectangle) dont la hauteur est proportionnelle à l’effectif. Les bandes ont toutes la même largeur et sont régulièrement espacées ; un axe gradué permet de lire les effectifs.</w:t>
+      </w:r>
+    </w:p>
+    <w:p>
+      <w:pPr>
+        <w:spacing w:after="110" w:line="300"/>
+        <w:jc w:val="both"/>
+      </w:pPr>
+      <w:r>
+        <w:rPr>
+          <w:rFonts w:ascii="Times New Roman" w:cs="Times New Roman" w:eastAsia="Times New Roman" w:hAnsi="Times New Roman"/>
+          <w:b/>
+          <w:bCs/>
+          <w:i w:val="false"/>
+          <w:iCs w:val="false"/>
+          <w:color w:val="1F4E79"/>
+          <w:sz w:val="24"/>
+          <w:szCs w:val="24"/>
+        </w:rPr>
+        <w:t xml:space="preserve">Autrement dit : </w:t>
+      </w:r>
+      <w:r>
+        <w:rPr>
+          <w:rFonts w:ascii="Times New Roman" w:cs="Times New Roman" w:eastAsia="Times New Roman" w:hAnsi="Times New Roman"/>
+          <w:b w:val="false"/>
+          <w:bCs w:val="false"/>
+          <w:i w:val="false"/>
+          <w:iCs w:val="false"/>
+          <w:color w:val="000000"/>
+          <w:sz w:val="24"/>
+          <w:szCs w:val="24"/>
+        </w:rPr>
+        <w:t xml:space="preserve">une bande par valeur, et plus l’effectif est grand, plus la bande monte.</w:t>
+      </w:r>
+    </w:p>
+    <w:p>
+      <w:pPr>
+        <w:spacing w:after="110" w:line="300"/>
+        <w:jc w:val="both"/>
+      </w:pPr>
+      <w:r>
+        <w:rPr>
+          <w:rFonts w:ascii="Times New Roman" w:cs="Times New Roman" w:eastAsia="Times New Roman" w:hAnsi="Times New Roman"/>
+          <w:b w:val="false"/>
+          <w:bCs w:val="false"/>
+          <w:i w:val="false"/>
+          <w:iCs w:val="false"/>
+          <w:color w:val="000000"/>
+          <w:sz w:val="24"/>
+          <w:szCs w:val="24"/>
+        </w:rPr>
+        <w:t xml:space="preserve">La construction exige trois soins : choisir une graduation régulière (ici 1 carreau = 1 élève), donner la même largeur à toutes les bandes, et écrire les noms sous les bandes. La lecture est alors immédiate : la bande la plus haute donne le mode, et les comparaisons se font à l’œil. À l’inverse, savoir LIRE un diagramme, c’est retrouver le tableau d’effectifs à partir des hauteurs.</w:t>
+      </w:r>
+    </w:p>
+    <w:p>
+      <w:pPr>
+        <w:spacing w:after="120" w:before="120"/>
+        <w:jc w:val="center"/>
+      </w:pPr>
+      <w:r>
+        <w:drawing>
+          <wp:inline distT="0" distB="0" distL="0" distR="0">
+            <wp:extent cx="4762500" cy="2352675"/>
+            <wp:effectExtent t="0" r="0" b="0" l="0"/>
+            <wp:docPr id="10" name="" descr="" title=""/>
+            <wp:cNvGraphicFramePr>
+              <a:graphicFrameLocks xmlns:a="http://schemas.openxmlformats.org/drawingml/2006/main" noChangeAspect="1"/>
+            </wp:cNvGraphicFramePr>
+            <a:graphic xmlns:a="http://schemas.openxmlformats.org/drawingml/2006/main">
+              <a:graphicData uri="http://schemas.openxmlformats.org/drawingml/2006/picture">
+                <pic:pic xmlns:pic="http://schemas.openxmlformats.org/drawingml/2006/picture">
+                  <pic:nvPicPr>
+                    <pic:cNvPr id="0" name="" descr=""/>
+                    <pic:cNvPicPr>
+                      <a:picLocks noChangeAspect="1" noChangeArrowheads="1"/>
+                    </pic:cNvPicPr>
+                  </pic:nvPicPr>
+                  <pic:blipFill>
+                    <a:blip r:embed="rId18" cstate="none"/>
                     <a:srcRect/>
                     <a:stretch>
                       <a:fillRect/>
@@ -17923,98 +18153,15 @@
     </w:p>
     <w:p>
       <w:pPr>
-        <w:spacing w:after="110" w:line="300"/>
-        <w:jc w:val="both"/>
-      </w:pPr>
-      <w:r>
-        <w:rPr>
-          <w:rFonts w:ascii="Times New Roman" w:cs="Times New Roman" w:eastAsia="Times New Roman" w:hAnsi="Times New Roman"/>
-          <w:b/>
-          <w:bCs/>
-          <w:i w:val="false"/>
-          <w:iCs w:val="false"/>
-          <w:color w:val="2E7D32"/>
-          <w:sz w:val="24"/>
-          <w:szCs w:val="24"/>
-        </w:rPr>
-        <w:t xml:space="preserve">Définition — </w:t>
-      </w:r>
-      <w:r>
-        <w:rPr>
-          <w:rFonts w:ascii="Times New Roman" w:cs="Times New Roman" w:eastAsia="Times New Roman" w:hAnsi="Times New Roman"/>
-          <w:b/>
-          <w:bCs/>
-          <w:i w:val="false"/>
-          <w:iCs w:val="false"/>
-          <w:color w:val="000000"/>
-          <w:sz w:val="24"/>
-          <w:szCs w:val="24"/>
-        </w:rPr>
-        <w:t xml:space="preserve">Un diagramme à ligne brisée représente l’évolution d’une grandeur dans le temps : chaque relevé devient un point (temps en abscisse, valeur en ordonnée) et les points successifs sont reliés par des segments.</w:t>
-      </w:r>
-    </w:p>
-    <w:p>
-      <w:pPr>
-        <w:spacing w:after="110" w:line="300"/>
-        <w:jc w:val="both"/>
-      </w:pPr>
-      <w:r>
-        <w:rPr>
-          <w:rFonts w:ascii="Times New Roman" w:cs="Times New Roman" w:eastAsia="Times New Roman" w:hAnsi="Times New Roman"/>
-          <w:b/>
-          <w:bCs/>
-          <w:i w:val="false"/>
-          <w:iCs w:val="false"/>
-          <w:color w:val="1F4E79"/>
-          <w:sz w:val="24"/>
-          <w:szCs w:val="24"/>
-        </w:rPr>
-        <w:t xml:space="preserve">Autrement dit : </w:t>
-      </w:r>
-      <w:r>
-        <w:rPr>
-          <w:rFonts w:ascii="Times New Roman" w:cs="Times New Roman" w:eastAsia="Times New Roman" w:hAnsi="Times New Roman"/>
-          <w:b w:val="false"/>
-          <w:bCs w:val="false"/>
-          <w:i w:val="false"/>
-          <w:iCs w:val="false"/>
-          <w:color w:val="000000"/>
-          <w:sz w:val="24"/>
-          <w:szCs w:val="24"/>
-        </w:rPr>
-        <w:t xml:space="preserve">un point par relevé, des segments pour les relier : la ligne raconte l’histoire — ça monte, ça descend.</w:t>
-      </w:r>
-    </w:p>
-    <w:p>
-      <w:pPr>
-        <w:spacing w:after="110" w:line="300"/>
-        <w:jc w:val="both"/>
-      </w:pPr>
-      <w:r>
-        <w:rPr>
-          <w:rFonts w:ascii="Times New Roman" w:cs="Times New Roman" w:eastAsia="Times New Roman" w:hAnsi="Times New Roman"/>
-          <w:b w:val="false"/>
-          <w:bCs w:val="false"/>
-          <w:i w:val="false"/>
-          <w:iCs w:val="false"/>
-          <w:color w:val="000000"/>
-          <w:sz w:val="24"/>
-          <w:szCs w:val="24"/>
-        </w:rPr>
-        <w:t xml:space="preserve">La ligne brisée convient aux données ordonnées dans le temps (jours, mois, années) : la pente des segments montre le sens et la vitesse de l’évolution — segment qui monte = hausse, qui descend = baisse, horizontal = stabilité. On repère d’un coup d’œil le maximum (vendredi, 28°) et le minimum (lundi, 22°). Pour des catégories sans ordre (fruits, sports), la ligne brisée n’a aucun sens : on garde les bandes.</w:t>
-      </w:r>
-    </w:p>
-    <w:p>
-      <w:pPr>
         <w:spacing w:after="120" w:before="120"/>
         <w:jc w:val="center"/>
       </w:pPr>
       <w:r>
         <w:drawing>
           <wp:inline distT="0" distB="0" distL="0" distR="0">
-            <wp:extent cx="4762500" cy="2209800"/>
+            <wp:extent cx="4095750" cy="2286000"/>
             <wp:effectExtent t="0" r="0" b="0" l="0"/>
-            <wp:docPr id="6" name="" descr="" title=""/>
+            <wp:docPr id="11" name="" descr="" title=""/>
             <wp:cNvGraphicFramePr>
               <a:graphicFrameLocks xmlns:a="http://schemas.openxmlformats.org/drawingml/2006/main" noChangeAspect="1"/>
             </wp:cNvGraphicFramePr>
@@ -18028,7 +18175,136 @@
                     </pic:cNvPicPr>
                   </pic:nvPicPr>
                   <pic:blipFill>
-                    <a:blip r:embed="rId14" cstate="none"/>
+                    <a:blip r:embed="rId19" cstate="none"/>
+                    <a:srcRect/>
+                    <a:stretch>
+                      <a:fillRect/>
+                    </a:stretch>
+                  </pic:blipFill>
+                  <pic:spPr bwMode="auto">
+                    <a:xfrm>
+                      <a:off x="0" y="0"/>
+                      <a:ext cx="4095750" cy="2286000"/>
+                    </a:xfrm>
+                    <a:prstGeom prst="rect">
+                      <a:avLst/>
+                    </a:prstGeom>
+                  </pic:spPr>
+                </pic:pic>
+              </a:graphicData>
+            </a:graphic>
+          </wp:inline>
+        </w:drawing>
+      </w:r>
+    </w:p>
+    <w:p>
+      <w:pPr>
+        <w:spacing w:after="110" w:line="300"/>
+        <w:jc w:val="both"/>
+      </w:pPr>
+      <w:r>
+        <w:rPr>
+          <w:rFonts w:ascii="Times New Roman" w:cs="Times New Roman" w:eastAsia="Times New Roman" w:hAnsi="Times New Roman"/>
+          <w:b/>
+          <w:bCs/>
+          <w:i w:val="false"/>
+          <w:iCs w:val="false"/>
+          <w:color w:val="2E7D32"/>
+          <w:sz w:val="24"/>
+          <w:szCs w:val="24"/>
+        </w:rPr>
+        <w:t xml:space="preserve">Définition — </w:t>
+      </w:r>
+      <w:r>
+        <w:rPr>
+          <w:rFonts w:ascii="Times New Roman" w:cs="Times New Roman" w:eastAsia="Times New Roman" w:hAnsi="Times New Roman"/>
+          <w:b/>
+          <w:bCs/>
+          <w:i w:val="false"/>
+          <w:iCs w:val="false"/>
+          <w:color w:val="000000"/>
+          <w:sz w:val="24"/>
+          <w:szCs w:val="24"/>
+        </w:rPr>
+        <w:t xml:space="preserve">Un diagramme à ligne brisée représente l’évolution d’une grandeur dans le temps : chaque relevé devient un point (temps en abscisse, valeur en ordonnée) et les points successifs sont reliés par des segments.</w:t>
+      </w:r>
+    </w:p>
+    <w:p>
+      <w:pPr>
+        <w:spacing w:after="110" w:line="300"/>
+        <w:jc w:val="both"/>
+      </w:pPr>
+      <w:r>
+        <w:rPr>
+          <w:rFonts w:ascii="Times New Roman" w:cs="Times New Roman" w:eastAsia="Times New Roman" w:hAnsi="Times New Roman"/>
+          <w:b/>
+          <w:bCs/>
+          <w:i w:val="false"/>
+          <w:iCs w:val="false"/>
+          <w:color w:val="1F4E79"/>
+          <w:sz w:val="24"/>
+          <w:szCs w:val="24"/>
+        </w:rPr>
+        <w:t xml:space="preserve">Autrement dit : </w:t>
+      </w:r>
+      <w:r>
+        <w:rPr>
+          <w:rFonts w:ascii="Times New Roman" w:cs="Times New Roman" w:eastAsia="Times New Roman" w:hAnsi="Times New Roman"/>
+          <w:b w:val="false"/>
+          <w:bCs w:val="false"/>
+          <w:i w:val="false"/>
+          <w:iCs w:val="false"/>
+          <w:color w:val="000000"/>
+          <w:sz w:val="24"/>
+          <w:szCs w:val="24"/>
+        </w:rPr>
+        <w:t xml:space="preserve">un point par relevé, des segments pour les relier : la ligne raconte l’histoire — ça monte, ça descend.</w:t>
+      </w:r>
+    </w:p>
+    <w:p>
+      <w:pPr>
+        <w:spacing w:after="110" w:line="300"/>
+        <w:jc w:val="both"/>
+      </w:pPr>
+      <w:r>
+        <w:rPr>
+          <w:rFonts w:ascii="Times New Roman" w:cs="Times New Roman" w:eastAsia="Times New Roman" w:hAnsi="Times New Roman"/>
+          <w:b w:val="false"/>
+          <w:bCs w:val="false"/>
+          <w:i w:val="false"/>
+          <w:iCs w:val="false"/>
+          <w:color w:val="000000"/>
+          <w:sz w:val="24"/>
+          <w:szCs w:val="24"/>
+        </w:rPr>
+        <w:t xml:space="preserve">La ligne brisée convient aux données ordonnées dans le temps (jours, mois, années) : la pente des segments montre le sens et la vitesse de l’évolution — segment qui monte = hausse, qui descend = baisse, horizontal = stabilité. On repère d’un coup d’œil le maximum (vendredi, 28°) et le minimum (lundi, 22°). Pour des catégories sans ordre (fruits, sports), la ligne brisée n’a aucun sens : on garde les bandes.</w:t>
+      </w:r>
+    </w:p>
+    <w:p>
+      <w:pPr>
+        <w:spacing w:after="120" w:before="120"/>
+        <w:jc w:val="center"/>
+      </w:pPr>
+      <w:r>
+        <w:drawing>
+          <wp:inline distT="0" distB="0" distL="0" distR="0">
+            <wp:extent cx="4762500" cy="2209800"/>
+            <wp:effectExtent t="0" r="0" b="0" l="0"/>
+            <wp:docPr id="12" name="" descr="" title=""/>
+            <wp:cNvGraphicFramePr>
+              <a:graphicFrameLocks xmlns:a="http://schemas.openxmlformats.org/drawingml/2006/main" noChangeAspect="1"/>
+            </wp:cNvGraphicFramePr>
+            <a:graphic xmlns:a="http://schemas.openxmlformats.org/drawingml/2006/main">
+              <a:graphicData uri="http://schemas.openxmlformats.org/drawingml/2006/picture">
+                <pic:pic xmlns:pic="http://schemas.openxmlformats.org/drawingml/2006/picture">
+                  <pic:nvPicPr>
+                    <pic:cNvPr id="0" name="" descr=""/>
+                    <pic:cNvPicPr>
+                      <a:picLocks noChangeAspect="1" noChangeArrowheads="1"/>
+                    </pic:cNvPicPr>
+                  </pic:nvPicPr>
+                  <pic:blipFill>
+                    <a:blip r:embed="rId20" cstate="none"/>
                     <a:srcRect/>
                     <a:stretch>
                       <a:fillRect/>
@@ -21015,6 +21291,52 @@
     </w:p>
     <w:p>
       <w:pPr>
+        <w:spacing w:after="120" w:before="120"/>
+        <w:jc w:val="center"/>
+      </w:pPr>
+      <w:r>
+        <w:drawing>
+          <wp:inline distT="0" distB="0" distL="0" distR="0">
+            <wp:extent cx="4095750" cy="2286000"/>
+            <wp:effectExtent t="0" r="0" b="0" l="0"/>
+            <wp:docPr id="13" name="" descr="" title=""/>
+            <wp:cNvGraphicFramePr>
+              <a:graphicFrameLocks xmlns:a="http://schemas.openxmlformats.org/drawingml/2006/main" noChangeAspect="1"/>
+            </wp:cNvGraphicFramePr>
+            <a:graphic xmlns:a="http://schemas.openxmlformats.org/drawingml/2006/main">
+              <a:graphicData uri="http://schemas.openxmlformats.org/drawingml/2006/picture">
+                <pic:pic xmlns:pic="http://schemas.openxmlformats.org/drawingml/2006/picture">
+                  <pic:nvPicPr>
+                    <pic:cNvPr id="0" name="" descr=""/>
+                    <pic:cNvPicPr>
+                      <a:picLocks noChangeAspect="1" noChangeArrowheads="1"/>
+                    </pic:cNvPicPr>
+                  </pic:nvPicPr>
+                  <pic:blipFill>
+                    <a:blip r:embed="rId21" cstate="none"/>
+                    <a:srcRect/>
+                    <a:stretch>
+                      <a:fillRect/>
+                    </a:stretch>
+                  </pic:blipFill>
+                  <pic:spPr bwMode="auto">
+                    <a:xfrm>
+                      <a:off x="0" y="0"/>
+                      <a:ext cx="4095750" cy="2286000"/>
+                    </a:xfrm>
+                    <a:prstGeom prst="rect">
+                      <a:avLst/>
+                    </a:prstGeom>
+                  </pic:spPr>
+                </pic:pic>
+              </a:graphicData>
+            </a:graphic>
+          </wp:inline>
+        </w:drawing>
+      </w:r>
+    </w:p>
+    <w:p>
+      <w:pPr>
         <w:spacing w:after="110" w:line="300"/>
         <w:jc w:val="both"/>
       </w:pPr>
@@ -21160,7 +21482,7 @@
           <wp:inline distT="0" distB="0" distL="0" distR="0">
             <wp:extent cx="4762500" cy="2495550"/>
             <wp:effectExtent t="0" r="0" b="0" l="0"/>
-            <wp:docPr id="7" name="" descr="" title=""/>
+            <wp:docPr id="14" name="" descr="" title=""/>
             <wp:cNvGraphicFramePr>
               <a:graphicFrameLocks xmlns:a="http://schemas.openxmlformats.org/drawingml/2006/main" noChangeAspect="1"/>
             </wp:cNvGraphicFramePr>
@@ -21174,7 +21496,7 @@
                     </pic:cNvPicPr>
                   </pic:nvPicPr>
                   <pic:blipFill>
-                    <a:blip r:embed="rId15" cstate="none"/>
+                    <a:blip r:embed="rId22" cstate="none"/>
                     <a:srcRect/>
                     <a:stretch>
                       <a:fillRect/>
@@ -24161,98 +24483,15 @@
     </w:p>
     <w:p>
       <w:pPr>
-        <w:spacing w:after="110" w:line="300"/>
-        <w:jc w:val="both"/>
-      </w:pPr>
-      <w:r>
-        <w:rPr>
-          <w:rFonts w:ascii="Times New Roman" w:cs="Times New Roman" w:eastAsia="Times New Roman" w:hAnsi="Times New Roman"/>
-          <w:b/>
-          <w:bCs/>
-          <w:i w:val="false"/>
-          <w:iCs w:val="false"/>
-          <w:color w:val="2E7D32"/>
-          <w:sz w:val="24"/>
-          <w:szCs w:val="24"/>
-        </w:rPr>
-        <w:t xml:space="preserve">Définition — </w:t>
-      </w:r>
-      <w:r>
-        <w:rPr>
-          <w:rFonts w:ascii="Times New Roman" w:cs="Times New Roman" w:eastAsia="Times New Roman" w:hAnsi="Times New Roman"/>
-          <w:b/>
-          <w:bCs/>
-          <w:i w:val="false"/>
-          <w:iCs w:val="false"/>
-          <w:color w:val="000000"/>
-          <w:sz w:val="24"/>
-          <w:szCs w:val="24"/>
-        </w:rPr>
-        <w:t xml:space="preserve">La moyenne simple de plusieurs valeurs est leur somme divisée par leur nombre. La moyenne pondérée tient compte des coefficients (ou des effectifs) : on divise la somme des produits valeur × coefficient par la somme des coefficients.</w:t>
-      </w:r>
-    </w:p>
-    <w:p>
-      <w:pPr>
-        <w:spacing w:after="110" w:line="300"/>
-        <w:jc w:val="both"/>
-      </w:pPr>
-      <w:r>
-        <w:rPr>
-          <w:rFonts w:ascii="Times New Roman" w:cs="Times New Roman" w:eastAsia="Times New Roman" w:hAnsi="Times New Roman"/>
-          <w:b/>
-          <w:bCs/>
-          <w:i w:val="false"/>
-          <w:iCs w:val="false"/>
-          <w:color w:val="1F4E79"/>
-          <w:sz w:val="24"/>
-          <w:szCs w:val="24"/>
-        </w:rPr>
-        <w:t xml:space="preserve">Autrement dit : </w:t>
-      </w:r>
-      <w:r>
-        <w:rPr>
-          <w:rFonts w:ascii="Times New Roman" w:cs="Times New Roman" w:eastAsia="Times New Roman" w:hAnsi="Times New Roman"/>
-          <w:b w:val="false"/>
-          <w:bCs w:val="false"/>
-          <w:i w:val="false"/>
-          <w:iCs w:val="false"/>
-          <w:color w:val="000000"/>
-          <w:sz w:val="24"/>
-          <w:szCs w:val="24"/>
-        </w:rPr>
-        <w:t xml:space="preserve">moyenne simple : tout le monde compte pareil ; moyenne pondérée : certaines valeurs comptent double ou triple.</w:t>
-      </w:r>
-    </w:p>
-    <w:p>
-      <w:pPr>
-        <w:spacing w:after="110" w:line="300"/>
-        <w:jc w:val="both"/>
-      </w:pPr>
-      <w:r>
-        <w:rPr>
-          <w:rFonts w:ascii="Times New Roman" w:cs="Times New Roman" w:eastAsia="Times New Roman" w:hAnsi="Times New Roman"/>
-          <w:b w:val="false"/>
-          <w:bCs w:val="false"/>
-          <w:i w:val="false"/>
-          <w:iCs w:val="false"/>
-          <w:color w:val="000000"/>
-          <w:sz w:val="24"/>
-          <w:szCs w:val="24"/>
-        </w:rPr>
-        <w:t xml:space="preserve">Pour Hery : (8 × 1 + 12 × 2 + 15 × 1) ÷ (1 + 2 + 1) = 47 ÷ 4 = 11,75. La moyenne pondérée sert aussi avec un tableau d’effectifs : si 4 élèves ont 10 et 6 élèves ont 15, la moyenne de la classe est (10 × 4 + 15 × 6) ÷ 10 = 13 — et non (10 + 15) ÷ 2 = 12,5 ! La moyenne se situe toujours entre la plus petite et la plus grande valeur : bon réflexe de vérification.</w:t>
-      </w:r>
-    </w:p>
-    <w:p>
-      <w:pPr>
         <w:spacing w:after="120" w:before="120"/>
         <w:jc w:val="center"/>
       </w:pPr>
       <w:r>
         <w:drawing>
           <wp:inline distT="0" distB="0" distL="0" distR="0">
-            <wp:extent cx="4762500" cy="2409825"/>
+            <wp:extent cx="4095750" cy="2286000"/>
             <wp:effectExtent t="0" r="0" b="0" l="0"/>
-            <wp:docPr id="8" name="" descr="" title=""/>
+            <wp:docPr id="15" name="" descr="" title=""/>
             <wp:cNvGraphicFramePr>
               <a:graphicFrameLocks xmlns:a="http://schemas.openxmlformats.org/drawingml/2006/main" noChangeAspect="1"/>
             </wp:cNvGraphicFramePr>
@@ -24266,7 +24505,136 @@
                     </pic:cNvPicPr>
                   </pic:nvPicPr>
                   <pic:blipFill>
-                    <a:blip r:embed="rId16" cstate="none"/>
+                    <a:blip r:embed="rId23" cstate="none"/>
+                    <a:srcRect/>
+                    <a:stretch>
+                      <a:fillRect/>
+                    </a:stretch>
+                  </pic:blipFill>
+                  <pic:spPr bwMode="auto">
+                    <a:xfrm>
+                      <a:off x="0" y="0"/>
+                      <a:ext cx="4095750" cy="2286000"/>
+                    </a:xfrm>
+                    <a:prstGeom prst="rect">
+                      <a:avLst/>
+                    </a:prstGeom>
+                  </pic:spPr>
+                </pic:pic>
+              </a:graphicData>
+            </a:graphic>
+          </wp:inline>
+        </w:drawing>
+      </w:r>
+    </w:p>
+    <w:p>
+      <w:pPr>
+        <w:spacing w:after="110" w:line="300"/>
+        <w:jc w:val="both"/>
+      </w:pPr>
+      <w:r>
+        <w:rPr>
+          <w:rFonts w:ascii="Times New Roman" w:cs="Times New Roman" w:eastAsia="Times New Roman" w:hAnsi="Times New Roman"/>
+          <w:b/>
+          <w:bCs/>
+          <w:i w:val="false"/>
+          <w:iCs w:val="false"/>
+          <w:color w:val="2E7D32"/>
+          <w:sz w:val="24"/>
+          <w:szCs w:val="24"/>
+        </w:rPr>
+        <w:t xml:space="preserve">Définition — </w:t>
+      </w:r>
+      <w:r>
+        <w:rPr>
+          <w:rFonts w:ascii="Times New Roman" w:cs="Times New Roman" w:eastAsia="Times New Roman" w:hAnsi="Times New Roman"/>
+          <w:b/>
+          <w:bCs/>
+          <w:i w:val="false"/>
+          <w:iCs w:val="false"/>
+          <w:color w:val="000000"/>
+          <w:sz w:val="24"/>
+          <w:szCs w:val="24"/>
+        </w:rPr>
+        <w:t xml:space="preserve">La moyenne simple de plusieurs valeurs est leur somme divisée par leur nombre. La moyenne pondérée tient compte des coefficients (ou des effectifs) : on divise la somme des produits valeur × coefficient par la somme des coefficients.</w:t>
+      </w:r>
+    </w:p>
+    <w:p>
+      <w:pPr>
+        <w:spacing w:after="110" w:line="300"/>
+        <w:jc w:val="both"/>
+      </w:pPr>
+      <w:r>
+        <w:rPr>
+          <w:rFonts w:ascii="Times New Roman" w:cs="Times New Roman" w:eastAsia="Times New Roman" w:hAnsi="Times New Roman"/>
+          <w:b/>
+          <w:bCs/>
+          <w:i w:val="false"/>
+          <w:iCs w:val="false"/>
+          <w:color w:val="1F4E79"/>
+          <w:sz w:val="24"/>
+          <w:szCs w:val="24"/>
+        </w:rPr>
+        <w:t xml:space="preserve">Autrement dit : </w:t>
+      </w:r>
+      <w:r>
+        <w:rPr>
+          <w:rFonts w:ascii="Times New Roman" w:cs="Times New Roman" w:eastAsia="Times New Roman" w:hAnsi="Times New Roman"/>
+          <w:b w:val="false"/>
+          <w:bCs w:val="false"/>
+          <w:i w:val="false"/>
+          <w:iCs w:val="false"/>
+          <w:color w:val="000000"/>
+          <w:sz w:val="24"/>
+          <w:szCs w:val="24"/>
+        </w:rPr>
+        <w:t xml:space="preserve">moyenne simple : tout le monde compte pareil ; moyenne pondérée : certaines valeurs comptent double ou triple.</w:t>
+      </w:r>
+    </w:p>
+    <w:p>
+      <w:pPr>
+        <w:spacing w:after="110" w:line="300"/>
+        <w:jc w:val="both"/>
+      </w:pPr>
+      <w:r>
+        <w:rPr>
+          <w:rFonts w:ascii="Times New Roman" w:cs="Times New Roman" w:eastAsia="Times New Roman" w:hAnsi="Times New Roman"/>
+          <w:b w:val="false"/>
+          <w:bCs w:val="false"/>
+          <w:i w:val="false"/>
+          <w:iCs w:val="false"/>
+          <w:color w:val="000000"/>
+          <w:sz w:val="24"/>
+          <w:szCs w:val="24"/>
+        </w:rPr>
+        <w:t xml:space="preserve">Pour Hery : (8 × 1 + 12 × 2 + 15 × 1) ÷ (1 + 2 + 1) = 47 ÷ 4 = 11,75. La moyenne pondérée sert aussi avec un tableau d’effectifs : si 4 élèves ont 10 et 6 élèves ont 15, la moyenne de la classe est (10 × 4 + 15 × 6) ÷ 10 = 13 — et non (10 + 15) ÷ 2 = 12,5 ! La moyenne se situe toujours entre la plus petite et la plus grande valeur : bon réflexe de vérification.</w:t>
+      </w:r>
+    </w:p>
+    <w:p>
+      <w:pPr>
+        <w:spacing w:after="120" w:before="120"/>
+        <w:jc w:val="center"/>
+      </w:pPr>
+      <w:r>
+        <w:drawing>
+          <wp:inline distT="0" distB="0" distL="0" distR="0">
+            <wp:extent cx="4762500" cy="2409825"/>
+            <wp:effectExtent t="0" r="0" b="0" l="0"/>
+            <wp:docPr id="16" name="" descr="" title=""/>
+            <wp:cNvGraphicFramePr>
+              <a:graphicFrameLocks xmlns:a="http://schemas.openxmlformats.org/drawingml/2006/main" noChangeAspect="1"/>
+            </wp:cNvGraphicFramePr>
+            <a:graphic xmlns:a="http://schemas.openxmlformats.org/drawingml/2006/main">
+              <a:graphicData uri="http://schemas.openxmlformats.org/drawingml/2006/picture">
+                <pic:pic xmlns:pic="http://schemas.openxmlformats.org/drawingml/2006/picture">
+                  <pic:nvPicPr>
+                    <pic:cNvPr id="0" name="" descr=""/>
+                    <pic:cNvPicPr>
+                      <a:picLocks noChangeAspect="1" noChangeArrowheads="1"/>
+                    </pic:cNvPicPr>
+                  </pic:nvPicPr>
+                  <pic:blipFill>
+                    <a:blip r:embed="rId24" cstate="none"/>
                     <a:srcRect/>
                     <a:stretch>
                       <a:fillRect/>
@@ -27658,6 +28026,52 @@
     </w:p>
     <w:p>
       <w:pPr>
+        <w:spacing w:after="120" w:before="120"/>
+        <w:jc w:val="center"/>
+      </w:pPr>
+      <w:r>
+        <w:drawing>
+          <wp:inline distT="0" distB="0" distL="0" distR="0">
+            <wp:extent cx="4095750" cy="2286000"/>
+            <wp:effectExtent t="0" r="0" b="0" l="0"/>
+            <wp:docPr id="17" name="" descr="" title=""/>
+            <wp:cNvGraphicFramePr>
+              <a:graphicFrameLocks xmlns:a="http://schemas.openxmlformats.org/drawingml/2006/main" noChangeAspect="1"/>
+            </wp:cNvGraphicFramePr>
+            <a:graphic xmlns:a="http://schemas.openxmlformats.org/drawingml/2006/main">
+              <a:graphicData uri="http://schemas.openxmlformats.org/drawingml/2006/picture">
+                <pic:pic xmlns:pic="http://schemas.openxmlformats.org/drawingml/2006/picture">
+                  <pic:nvPicPr>
+                    <pic:cNvPr id="0" name="" descr=""/>
+                    <pic:cNvPicPr>
+                      <a:picLocks noChangeAspect="1" noChangeArrowheads="1"/>
+                    </pic:cNvPicPr>
+                  </pic:nvPicPr>
+                  <pic:blipFill>
+                    <a:blip r:embed="rId25" cstate="none"/>
+                    <a:srcRect/>
+                    <a:stretch>
+                      <a:fillRect/>
+                    </a:stretch>
+                  </pic:blipFill>
+                  <pic:spPr bwMode="auto">
+                    <a:xfrm>
+                      <a:off x="0" y="0"/>
+                      <a:ext cx="4095750" cy="2286000"/>
+                    </a:xfrm>
+                    <a:prstGeom prst="rect">
+                      <a:avLst/>
+                    </a:prstGeom>
+                  </pic:spPr>
+                </pic:pic>
+              </a:graphicData>
+            </a:graphic>
+          </wp:inline>
+        </w:drawing>
+      </w:r>
+    </w:p>
+    <w:p>
+      <w:pPr>
         <w:spacing w:after="110" w:line="300"/>
         <w:jc w:val="both"/>
       </w:pPr>
@@ -27857,7 +28271,7 @@
           <wp:inline distT="0" distB="0" distL="0" distR="0">
             <wp:extent cx="4762500" cy="2076450"/>
             <wp:effectExtent t="0" r="0" b="0" l="0"/>
-            <wp:docPr id="9" name="" descr="" title=""/>
+            <wp:docPr id="18" name="" descr="" title=""/>
             <wp:cNvGraphicFramePr>
               <a:graphicFrameLocks xmlns:a="http://schemas.openxmlformats.org/drawingml/2006/main" noChangeAspect="1"/>
             </wp:cNvGraphicFramePr>
@@ -27871,7 +28285,7 @@
                     </pic:cNvPicPr>
                   </pic:nvPicPr>
                   <pic:blipFill>
-                    <a:blip r:embed="rId17" cstate="none"/>
+                    <a:blip r:embed="rId26" cstate="none"/>
                     <a:srcRect/>
                     <a:stretch>
                       <a:fillRect/>
@@ -31290,6 +31704,52 @@
     </w:p>
     <w:p>
       <w:pPr>
+        <w:spacing w:after="120" w:before="120"/>
+        <w:jc w:val="center"/>
+      </w:pPr>
+      <w:r>
+        <w:drawing>
+          <wp:inline distT="0" distB="0" distL="0" distR="0">
+            <wp:extent cx="4095750" cy="2286000"/>
+            <wp:effectExtent t="0" r="0" b="0" l="0"/>
+            <wp:docPr id="19" name="" descr="" title=""/>
+            <wp:cNvGraphicFramePr>
+              <a:graphicFrameLocks xmlns:a="http://schemas.openxmlformats.org/drawingml/2006/main" noChangeAspect="1"/>
+            </wp:cNvGraphicFramePr>
+            <a:graphic xmlns:a="http://schemas.openxmlformats.org/drawingml/2006/main">
+              <a:graphicData uri="http://schemas.openxmlformats.org/drawingml/2006/picture">
+                <pic:pic xmlns:pic="http://schemas.openxmlformats.org/drawingml/2006/picture">
+                  <pic:nvPicPr>
+                    <pic:cNvPr id="0" name="" descr=""/>
+                    <pic:cNvPicPr>
+                      <a:picLocks noChangeAspect="1" noChangeArrowheads="1"/>
+                    </pic:cNvPicPr>
+                  </pic:nvPicPr>
+                  <pic:blipFill>
+                    <a:blip r:embed="rId27" cstate="none"/>
+                    <a:srcRect/>
+                    <a:stretch>
+                      <a:fillRect/>
+                    </a:stretch>
+                  </pic:blipFill>
+                  <pic:spPr bwMode="auto">
+                    <a:xfrm>
+                      <a:off x="0" y="0"/>
+                      <a:ext cx="4095750" cy="2286000"/>
+                    </a:xfrm>
+                    <a:prstGeom prst="rect">
+                      <a:avLst/>
+                    </a:prstGeom>
+                  </pic:spPr>
+                </pic:pic>
+              </a:graphicData>
+            </a:graphic>
+          </wp:inline>
+        </w:drawing>
+      </w:r>
+    </w:p>
+    <w:p>
+      <w:pPr>
         <w:spacing w:after="110" w:line="300"/>
         <w:jc w:val="both"/>
       </w:pPr>
@@ -31435,7 +31895,7 @@
           <wp:inline distT="0" distB="0" distL="0" distR="0">
             <wp:extent cx="4762500" cy="1685925"/>
             <wp:effectExtent t="0" r="0" b="0" l="0"/>
-            <wp:docPr id="10" name="" descr="" title=""/>
+            <wp:docPr id="20" name="" descr="" title=""/>
             <wp:cNvGraphicFramePr>
               <a:graphicFrameLocks xmlns:a="http://schemas.openxmlformats.org/drawingml/2006/main" noChangeAspect="1"/>
             </wp:cNvGraphicFramePr>
@@ -31449,7 +31909,7 @@
                     </pic:cNvPicPr>
                   </pic:nvPicPr>
                   <pic:blipFill>
-                    <a:blip r:embed="rId18" cstate="none"/>
+                    <a:blip r:embed="rId28" cstate="none"/>
                     <a:srcRect/>
                     <a:stretch>
                       <a:fillRect/>
@@ -34652,6 +35112,52 @@
     </w:p>
     <w:p>
       <w:pPr>
+        <w:spacing w:after="120" w:before="120"/>
+        <w:jc w:val="center"/>
+      </w:pPr>
+      <w:r>
+        <w:drawing>
+          <wp:inline distT="0" distB="0" distL="0" distR="0">
+            <wp:extent cx="4095750" cy="2286000"/>
+            <wp:effectExtent t="0" r="0" b="0" l="0"/>
+            <wp:docPr id="21" name="" descr="" title=""/>
+            <wp:cNvGraphicFramePr>
+              <a:graphicFrameLocks xmlns:a="http://schemas.openxmlformats.org/drawingml/2006/main" noChangeAspect="1"/>
+            </wp:cNvGraphicFramePr>
+            <a:graphic xmlns:a="http://schemas.openxmlformats.org/drawingml/2006/main">
+              <a:graphicData uri="http://schemas.openxmlformats.org/drawingml/2006/picture">
+                <pic:pic xmlns:pic="http://schemas.openxmlformats.org/drawingml/2006/picture">
+                  <pic:nvPicPr>
+                    <pic:cNvPr id="0" name="" descr=""/>
+                    <pic:cNvPicPr>
+                      <a:picLocks noChangeAspect="1" noChangeArrowheads="1"/>
+                    </pic:cNvPicPr>
+                  </pic:nvPicPr>
+                  <pic:blipFill>
+                    <a:blip r:embed="rId29" cstate="none"/>
+                    <a:srcRect/>
+                    <a:stretch>
+                      <a:fillRect/>
+                    </a:stretch>
+                  </pic:blipFill>
+                  <pic:spPr bwMode="auto">
+                    <a:xfrm>
+                      <a:off x="0" y="0"/>
+                      <a:ext cx="4095750" cy="2286000"/>
+                    </a:xfrm>
+                    <a:prstGeom prst="rect">
+                      <a:avLst/>
+                    </a:prstGeom>
+                  </pic:spPr>
+                </pic:pic>
+              </a:graphicData>
+            </a:graphic>
+          </wp:inline>
+        </w:drawing>
+      </w:r>
+    </w:p>
+    <w:p>
+      <w:pPr>
         <w:spacing w:after="110" w:line="300"/>
         <w:jc w:val="both"/>
       </w:pPr>
@@ -34824,7 +35330,7 @@
           <wp:inline distT="0" distB="0" distL="0" distR="0">
             <wp:extent cx="4762500" cy="2305050"/>
             <wp:effectExtent t="0" r="0" b="0" l="0"/>
-            <wp:docPr id="11" name="" descr="" title=""/>
+            <wp:docPr id="22" name="" descr="" title=""/>
             <wp:cNvGraphicFramePr>
               <a:graphicFrameLocks xmlns:a="http://schemas.openxmlformats.org/drawingml/2006/main" noChangeAspect="1"/>
             </wp:cNvGraphicFramePr>
@@ -34838,7 +35344,7 @@
                     </pic:cNvPicPr>
                   </pic:nvPicPr>
                   <pic:blipFill>
-                    <a:blip r:embed="rId19" cstate="none"/>
+                    <a:blip r:embed="rId30" cstate="none"/>
                     <a:srcRect/>
                     <a:stretch>
                       <a:fillRect/>

</xml_diff>